<commit_message>
Updated Pokemon data and SAP
</commit_message>
<xml_diff>
--- a/assets/SAP_v2_Pokemon.docx
+++ b/assets/SAP_v2_Pokemon.docx
@@ -1454,7 +1454,35 @@
           <w:sz w:val="21"/>
           <w:szCs w:val="21"/>
         </w:rPr>
-        <w:t xml:space="preserve"> without substantial loss of information. This variable is used as a categorical variable with four levels: equal, mostly males, mostly females, genderless. This is helpful for </w:t>
+        <w:t xml:space="preserve"> without substantial loss of information. This variable is used as a categorical variable with four levels: equal, mostly</w:t>
+      </w:r>
+      <w:r>
+        <w:rPr>
+          <w:sz w:val="21"/>
+          <w:szCs w:val="21"/>
+        </w:rPr>
+        <w:t xml:space="preserve"> or all</w:t>
+      </w:r>
+      <w:r>
+        <w:rPr>
+          <w:sz w:val="21"/>
+          <w:szCs w:val="21"/>
+        </w:rPr>
+        <w:t xml:space="preserve"> males, mostly </w:t>
+      </w:r>
+      <w:r>
+        <w:rPr>
+          <w:sz w:val="21"/>
+          <w:szCs w:val="21"/>
+        </w:rPr>
+        <w:t xml:space="preserve">or all </w:t>
+      </w:r>
+      <w:r>
+        <w:rPr>
+          <w:sz w:val="21"/>
+          <w:szCs w:val="21"/>
+        </w:rPr>
+        <w:t xml:space="preserve">females, genderless. This is helpful for </w:t>
       </w:r>
       <w:proofErr w:type="gramStart"/>
       <w:r>
@@ -1569,23 +1597,31 @@
           <w:sz w:val="21"/>
           <w:szCs w:val="21"/>
         </w:rPr>
-        <w:t xml:space="preserve">Catch rate: species-specific integer that determines how difficult a Pokémon is to catch. Higher values indicate that a species is easier to catch. The very large (negative) correlation between catch rate and the base stats indicates that the use of this variable in </w:t>
-      </w:r>
-      <w:proofErr w:type="spellStart"/>
-      <w:r>
-        <w:rPr>
-          <w:sz w:val="21"/>
-          <w:szCs w:val="21"/>
-        </w:rPr>
-        <w:t>modeling</w:t>
-      </w:r>
-      <w:proofErr w:type="spellEnd"/>
-      <w:r>
-        <w:rPr>
-          <w:sz w:val="21"/>
-          <w:szCs w:val="21"/>
-        </w:rPr>
-        <w:t xml:space="preserve"> might not contribute much to prediction.</w:t>
+        <w:t xml:space="preserve">Catch rate: species-specific integer that determines how difficult a Pokémon is to catch. Higher values indicate that a species is easier to catch. </w:t>
+      </w:r>
+      <w:r>
+        <w:t xml:space="preserve">Catch rate </w:t>
+      </w:r>
+      <w:r>
+        <w:t>is strongly concentrated (&gt;300 of 1025 Pokémon have the value 50) and associated with the base statistics (r ≈ −0.73 with Total Base Stats)</w:t>
+      </w:r>
+      <w:r>
+        <w:t xml:space="preserve">. </w:t>
+      </w:r>
+      <w:r>
+        <w:t>F</w:t>
+      </w:r>
+      <w:r>
+        <w:t xml:space="preserve">or parsimony, </w:t>
+      </w:r>
+      <w:r>
+        <w:t>catch rate was omitted a priori from the multivariable model.</w:t>
+      </w:r>
+      <w:r>
+        <w:t xml:space="preserve"> </w:t>
+      </w:r>
+      <w:r>
+        <w:t>This does not imply that it is unrelated to weight.</w:t>
       </w:r>
     </w:p>
     <w:p>
@@ -1737,7 +1773,7 @@
           <w:sz w:val="21"/>
           <w:szCs w:val="21"/>
         </w:rPr>
-        <w:t xml:space="preserve">, which evolves in Charizard. Size of families varies from 1 (non-evolving species) to 9 (Eevee family) but the typical values are 2 or 3. Evolutionary family might be considered as a grouping variable to </w:t>
+        <w:t>, which evolves in Charizard. Size of families varies from 1 (non-evolving species) to 9 (Eevee family</w:t>
       </w:r>
       <w:proofErr w:type="gramStart"/>
       <w:r>
@@ -1745,6 +1781,22 @@
           <w:sz w:val="21"/>
           <w:szCs w:val="21"/>
         </w:rPr>
+        <w:t>)</w:t>
+      </w:r>
+      <w:proofErr w:type="gramEnd"/>
+      <w:r>
+        <w:rPr>
+          <w:sz w:val="21"/>
+          <w:szCs w:val="21"/>
+        </w:rPr>
+        <w:t xml:space="preserve"> but the typical values are 2 or 3. Evolutionary family might be considered as a grouping variable to </w:t>
+      </w:r>
+      <w:proofErr w:type="gramStart"/>
+      <w:r>
+        <w:rPr>
+          <w:sz w:val="21"/>
+          <w:szCs w:val="21"/>
+        </w:rPr>
         <w:t>take into account</w:t>
       </w:r>
       <w:proofErr w:type="gramEnd"/>
@@ -1781,7 +1833,7 @@
           <w:sz w:val="21"/>
           <w:szCs w:val="21"/>
         </w:rPr>
-        <w:t xml:space="preserve"> as a binary variable to represent each type, rather than the two separate types. Type may have a modifying effect on the relationship between height and weight, as </w:t>
+        <w:t xml:space="preserve"> as a binary variable to represent each type, rather than the </w:t>
       </w:r>
       <w:r>
         <w:rPr>
@@ -1789,7 +1841,7 @@
           <w:szCs w:val="21"/>
         </w:rPr>
         <w:lastRenderedPageBreak/>
-        <w:t>some types may tend to be denser than others (e.g., rock or steel type are likely denser than ghost or fairy type).</w:t>
+        <w:t>two separate types. Type may have a modifying effect on the relationship between height and weight, as some types may tend to be denser than others (e.g., rock or steel type are likely denser than ghost or fairy type).</w:t>
       </w:r>
     </w:p>
     <w:p>
@@ -3550,12 +3602,33 @@
             </w:tcMar>
           </w:tcPr>
           <w:p>
-            <w:r>
-              <w:rPr>
-                <w:sz w:val="18"/>
-                <w:szCs w:val="18"/>
-              </w:rPr>
-              <w:t>Catch rate has a strong negative association with base stats variables (MV).</w:t>
+            <w:pPr>
+              <w:rPr>
+                <w:sz w:val="18"/>
+                <w:szCs w:val="18"/>
+              </w:rPr>
+            </w:pPr>
+            <w:r>
+              <w:rPr>
+                <w:sz w:val="18"/>
+                <w:szCs w:val="18"/>
+              </w:rPr>
+              <w:t xml:space="preserve">Catch rate </w:t>
+            </w:r>
+          </w:p>
+          <w:p>
+            <w:pPr>
+              <w:rPr>
+                <w:sz w:val="18"/>
+                <w:szCs w:val="18"/>
+              </w:rPr>
+            </w:pPr>
+            <w:r>
+              <w:rPr>
+                <w:sz w:val="18"/>
+                <w:szCs w:val="18"/>
+              </w:rPr>
+              <w:t>is strongly concentrated (&gt;300 of 1025 Pokémon have the value 50) and associated with the base statistics (r ≈ −0.73 with Total Base Stats) (MV).</w:t>
             </w:r>
           </w:p>
         </w:tc>
@@ -3570,13 +3643,27 @@
             </w:tcMar>
           </w:tcPr>
           <w:p>
-            <w:r>
-              <w:rPr>
-                <w:sz w:val="18"/>
-                <w:szCs w:val="18"/>
-              </w:rPr>
-              <w:t>It is unlikely that catch rate will be an important covariate in the model.</w:t>
-            </w:r>
+            <w:pPr>
+              <w:rPr>
+                <w:sz w:val="18"/>
+                <w:szCs w:val="18"/>
+              </w:rPr>
+            </w:pPr>
+            <w:r>
+              <w:rPr>
+                <w:sz w:val="18"/>
+                <w:szCs w:val="18"/>
+              </w:rPr>
+              <w:t>For parsimony, catch rate was omitted a priori from the multivariable model. This does not imply that it is unrelated to weight.</w:t>
+            </w:r>
+          </w:p>
+          <w:p>
+            <w:pPr>
+              <w:rPr>
+                <w:sz w:val="18"/>
+                <w:szCs w:val="18"/>
+              </w:rPr>
+            </w:pPr>
           </w:p>
         </w:tc>
         <w:tc>
@@ -3590,12 +3677,18 @@
             </w:tcMar>
           </w:tcPr>
           <w:p>
-            <w:r>
-              <w:rPr>
-                <w:sz w:val="18"/>
-                <w:szCs w:val="18"/>
-              </w:rPr>
-              <w:t>Given its very large negative correlation with the base stats, catch rate is omitted a priori from the multivariable model (A2-updated, Section 7.2.2), rather than being included and left to backward selection to remove.</w:t>
+            <w:pPr>
+              <w:rPr>
+                <w:sz w:val="18"/>
+                <w:szCs w:val="18"/>
+              </w:rPr>
+            </w:pPr>
+            <w:r>
+              <w:rPr>
+                <w:sz w:val="18"/>
+                <w:szCs w:val="18"/>
+              </w:rPr>
+              <w:t>Catch rate was not included in the initial multivariable model or in the backward-selection procedure, consistent with its planned omission based on the IDA finding.</w:t>
             </w:r>
           </w:p>
         </w:tc>
@@ -3784,7 +3877,15 @@
           <w:sz w:val="21"/>
           <w:szCs w:val="21"/>
         </w:rPr>
-        <w:t>Type is represented by two variables: Type 1 and Type 2. However, these variables are not hierarchical and for Pokémon species with two types, neither type is dominant. For Type 2, missing values represent single-type Pokémon. IDA summaries stratified by type consider if a species belongs to a type or not (regardless of whether it is type 1 or 2).</w:t>
+        <w:t xml:space="preserve">Type is represented by two variables: Type 1 and Type 2. However, these variables are not hierarchical and for Pokémon species with two types, neither type is dominant. For Type 2, missing </w:t>
+      </w:r>
+      <w:r>
+        <w:rPr>
+          <w:sz w:val="21"/>
+          <w:szCs w:val="21"/>
+        </w:rPr>
+        <w:lastRenderedPageBreak/>
+        <w:t>values represent single-type Pokémon. IDA summaries stratified by type consider if a species belongs to a type or not (regardless of whether it is type 1 or 2).</w:t>
       </w:r>
     </w:p>
     <w:p>
@@ -3793,7 +3894,6 @@
         <w:spacing w:before="200" w:after="100"/>
       </w:pPr>
       <w:r>
-        <w:lastRenderedPageBreak/>
         <w:t>7.2.2 Updates to MDA (section 5.2)</w:t>
       </w:r>
     </w:p>
@@ -3937,7 +4037,21 @@
           <w:sz w:val="21"/>
           <w:szCs w:val="21"/>
         </w:rPr>
-        <w:t>Catch rate is identified as a variable with large association with base stats and not used in the regression model</w:t>
+        <w:t xml:space="preserve">Catch rate is identified as a variable </w:t>
+      </w:r>
+      <w:r>
+        <w:rPr>
+          <w:sz w:val="21"/>
+          <w:szCs w:val="21"/>
+        </w:rPr>
+        <w:t xml:space="preserve">strongly concentrated in some values and with </w:t>
+      </w:r>
+      <w:r>
+        <w:rPr>
+          <w:sz w:val="21"/>
+          <w:szCs w:val="21"/>
+        </w:rPr>
+        <w:t>large association with base stats and not used in the regression model</w:t>
       </w:r>
     </w:p>
     <w:p>
@@ -3955,6 +4069,10 @@
     <w:p>
       <w:pPr>
         <w:spacing w:after="120"/>
+        <w:rPr>
+          <w:sz w:val="21"/>
+          <w:szCs w:val="21"/>
+        </w:rPr>
       </w:pPr>
       <w:r>
         <w:rPr>
@@ -4030,14 +4148,52 @@
     </w:p>
     <w:p>
       <w:pPr>
+        <w:rPr>
+          <w:sz w:val="21"/>
+          <w:szCs w:val="21"/>
+        </w:rPr>
+      </w:pPr>
+      <w:r>
+        <w:rPr>
+          <w:sz w:val="21"/>
+          <w:szCs w:val="21"/>
+        </w:rPr>
+        <w:t>Catch rate is strongly concentrated (&gt;300 of 1025 Pokémon have the value 50) and associated with the base statistics (r ≈ −0.73 with Total Base Stats) (MV).</w:t>
+      </w:r>
+      <w:r>
+        <w:rPr>
+          <w:sz w:val="21"/>
+          <w:szCs w:val="21"/>
+        </w:rPr>
+        <w:t xml:space="preserve"> </w:t>
+      </w:r>
+      <w:r>
+        <w:rPr>
+          <w:sz w:val="21"/>
+          <w:szCs w:val="21"/>
+        </w:rPr>
+        <w:t>For parsimony, catch rate was omitted a priori from the multivariable model. This does not imply that it is unrelated to weight.</w:t>
+      </w:r>
+    </w:p>
+    <w:p>
+      <w:pPr>
         <w:spacing w:after="120"/>
-      </w:pPr>
-      <w:r>
-        <w:rPr>
-          <w:sz w:val="21"/>
-          <w:szCs w:val="21"/>
-        </w:rPr>
-        <w:t xml:space="preserve">The very large (negative) correlation between catch rate and the base stats indicates that the use of this variable in </w:t>
+        <w:rPr>
+          <w:sz w:val="21"/>
+          <w:szCs w:val="21"/>
+        </w:rPr>
+      </w:pPr>
+    </w:p>
+    <w:p>
+      <w:pPr>
+        <w:spacing w:after="120"/>
+      </w:pPr>
+      <w:r>
+        <w:rPr>
+          <w:sz w:val="21"/>
+          <w:szCs w:val="21"/>
+        </w:rPr>
+        <w:t xml:space="preserve">The base stats variables are generally strongly associated to total, but not necessarily over the whole range of their values (total does not increase with HP, special </w:t>
       </w:r>
       <w:proofErr w:type="spellStart"/>
       <w:r>
@@ -4045,6 +4201,355 @@
           <w:sz w:val="21"/>
           <w:szCs w:val="21"/>
         </w:rPr>
+        <w:t>defense</w:t>
+      </w:r>
+      <w:proofErr w:type="spellEnd"/>
+      <w:r>
+        <w:rPr>
+          <w:sz w:val="21"/>
+          <w:szCs w:val="21"/>
+        </w:rPr>
+        <w:t xml:space="preserve"> and </w:t>
+      </w:r>
+      <w:proofErr w:type="spellStart"/>
+      <w:r>
+        <w:rPr>
+          <w:sz w:val="21"/>
+          <w:szCs w:val="21"/>
+        </w:rPr>
+        <w:t>defense</w:t>
+      </w:r>
+      <w:proofErr w:type="spellEnd"/>
+      <w:r>
+        <w:rPr>
+          <w:sz w:val="21"/>
+          <w:szCs w:val="21"/>
+        </w:rPr>
+        <w:t xml:space="preserve"> for their large values, some Pokémon can have large/low values of one variable but not necessarily also in the total). The base stats are less associated with height compared to total. The six base stats seem to carry additional information compared to Total, speed has distinct features from others, for example speed and </w:t>
+      </w:r>
+      <w:proofErr w:type="spellStart"/>
+      <w:r>
+        <w:rPr>
+          <w:sz w:val="21"/>
+          <w:szCs w:val="21"/>
+        </w:rPr>
+        <w:t>defense</w:t>
+      </w:r>
+      <w:proofErr w:type="spellEnd"/>
+      <w:r>
+        <w:rPr>
+          <w:sz w:val="21"/>
+          <w:szCs w:val="21"/>
+        </w:rPr>
+        <w:t xml:space="preserve"> have an extremely low correlation. In regression model the use of the six base stats might be more informative than the use of total, as the six base stats provide to some extent some heterogeneous information about the Pokémon strengths.</w:t>
+      </w:r>
+    </w:p>
+    <w:p>
+      <w:pPr>
+        <w:spacing w:after="120"/>
+      </w:pPr>
+      <w:r>
+        <w:rPr>
+          <w:sz w:val="21"/>
+          <w:szCs w:val="21"/>
+        </w:rPr>
+        <w:t xml:space="preserve">It is however possible that the correlation between the base stats might inflate the standard errors of the estimated coefficient, or cause some instability in the model, or that some of the variables will not contribute to improve prediction (for example special attack and special </w:t>
+      </w:r>
+      <w:proofErr w:type="spellStart"/>
+      <w:r>
+        <w:rPr>
+          <w:sz w:val="21"/>
+          <w:szCs w:val="21"/>
+        </w:rPr>
+        <w:t>defense</w:t>
+      </w:r>
+      <w:proofErr w:type="spellEnd"/>
+      <w:r>
+        <w:rPr>
+          <w:sz w:val="21"/>
+          <w:szCs w:val="21"/>
+        </w:rPr>
+        <w:t>, see also the graphs in the next section).</w:t>
+      </w:r>
+    </w:p>
+    <w:p>
+      <w:pPr>
+        <w:spacing w:after="120"/>
+      </w:pPr>
+      <w:r>
+        <w:rPr>
+          <w:sz w:val="21"/>
+          <w:szCs w:val="21"/>
+        </w:rPr>
+        <w:t>We observed a large association also between other variables that we are considering as potential explanatory variables in the multivariable model. For example, evolutionary stage and special status are strongly associated. Nevertheless, both variables are considered potentially important based on background knowledge. Therefore, we decided to employ backward variable selection based on AIC to select the variables to include in a final model. Log-transformed variables were created (</w:t>
+      </w:r>
+      <w:proofErr w:type="spellStart"/>
+      <w:r>
+        <w:rPr>
+          <w:sz w:val="21"/>
+          <w:szCs w:val="21"/>
+        </w:rPr>
+        <w:t>log_weight_kg</w:t>
+      </w:r>
+      <w:proofErr w:type="spellEnd"/>
+      <w:r>
+        <w:rPr>
+          <w:sz w:val="21"/>
+          <w:szCs w:val="21"/>
+        </w:rPr>
+        <w:t xml:space="preserve"> and </w:t>
+      </w:r>
+      <w:proofErr w:type="spellStart"/>
+      <w:r>
+        <w:rPr>
+          <w:sz w:val="21"/>
+          <w:szCs w:val="21"/>
+        </w:rPr>
+        <w:t>log_height_m</w:t>
+      </w:r>
+      <w:proofErr w:type="spellEnd"/>
+      <w:r>
+        <w:rPr>
+          <w:sz w:val="21"/>
+          <w:szCs w:val="21"/>
+        </w:rPr>
+        <w:t>), and histograms and Q-Q plots show the transformed versions are approximately normally distributed. These transformed versions of weight and height will be used as the outcome and explanatory variables in the regression models, respectively.</w:t>
+      </w:r>
+    </w:p>
+    <w:p>
+      <w:pPr>
+        <w:spacing w:after="120"/>
+      </w:pPr>
+      <w:r>
+        <w:rPr>
+          <w:sz w:val="21"/>
+          <w:szCs w:val="21"/>
+        </w:rPr>
+        <w:t>The Baby Pokémon phase category has a small sample size (only 17 observed). Therefore, Base will be used as the reference category for Pokémon phase. Similarly, normal status and normal happiness will be used as reference categories.</w:t>
+      </w:r>
+    </w:p>
+    <w:p>
+      <w:pPr>
+        <w:spacing w:after="120"/>
+      </w:pPr>
+      <w:r>
+        <w:rPr>
+          <w:sz w:val="21"/>
+          <w:szCs w:val="21"/>
+        </w:rPr>
+        <w:lastRenderedPageBreak/>
+        <w:t xml:space="preserve">To identify Pokémon species with unusual combinations of base-stat values in a systematic and reproducible way, we defined a profile imbalance index: each of the six base stats was standardized (z-scores across all 1,025 species), and for each species we computed the standard deviation of its own six standardized values. </w:t>
+      </w:r>
+      <w:proofErr w:type="spellStart"/>
+      <w:r>
+        <w:rPr>
+          <w:sz w:val="21"/>
+          <w:szCs w:val="21"/>
+        </w:rPr>
+        <w:t>Shuckle</w:t>
+      </w:r>
+      <w:proofErr w:type="spellEnd"/>
+      <w:r>
+        <w:rPr>
+          <w:sz w:val="21"/>
+          <w:szCs w:val="21"/>
+        </w:rPr>
+        <w:t xml:space="preserve"> has the single most unbalanced profile: very low hp, attack and special attack, but the highest </w:t>
+      </w:r>
+      <w:proofErr w:type="spellStart"/>
+      <w:r>
+        <w:rPr>
+          <w:sz w:val="21"/>
+          <w:szCs w:val="21"/>
+        </w:rPr>
+        <w:t>defense</w:t>
+      </w:r>
+      <w:proofErr w:type="spellEnd"/>
+      <w:r>
+        <w:rPr>
+          <w:sz w:val="21"/>
+          <w:szCs w:val="21"/>
+        </w:rPr>
+        <w:t xml:space="preserve"> and special </w:t>
+      </w:r>
+      <w:proofErr w:type="spellStart"/>
+      <w:r>
+        <w:rPr>
+          <w:sz w:val="21"/>
+          <w:szCs w:val="21"/>
+        </w:rPr>
+        <w:t>defense</w:t>
+      </w:r>
+      <w:proofErr w:type="spellEnd"/>
+      <w:r>
+        <w:rPr>
+          <w:sz w:val="21"/>
+          <w:szCs w:val="21"/>
+        </w:rPr>
+        <w:t xml:space="preserve"> in the dataset. </w:t>
+      </w:r>
+      <w:proofErr w:type="spellStart"/>
+      <w:r>
+        <w:rPr>
+          <w:sz w:val="21"/>
+          <w:szCs w:val="21"/>
+        </w:rPr>
+        <w:t>Blissey</w:t>
+      </w:r>
+      <w:proofErr w:type="spellEnd"/>
+      <w:r>
+        <w:rPr>
+          <w:sz w:val="21"/>
+          <w:szCs w:val="21"/>
+        </w:rPr>
+        <w:t xml:space="preserve"> and Chansey rank second and third, with extremely high hp but low attack and </w:t>
+      </w:r>
+      <w:proofErr w:type="spellStart"/>
+      <w:r>
+        <w:rPr>
+          <w:sz w:val="21"/>
+          <w:szCs w:val="21"/>
+        </w:rPr>
+        <w:t>defense</w:t>
+      </w:r>
+      <w:proofErr w:type="spellEnd"/>
+      <w:r>
+        <w:rPr>
+          <w:sz w:val="21"/>
+          <w:szCs w:val="21"/>
+        </w:rPr>
+        <w:t xml:space="preserve">. </w:t>
+      </w:r>
+      <w:proofErr w:type="spellStart"/>
+      <w:r>
+        <w:rPr>
+          <w:sz w:val="21"/>
+          <w:szCs w:val="21"/>
+        </w:rPr>
+        <w:t>Guzzlord</w:t>
+      </w:r>
+      <w:proofErr w:type="spellEnd"/>
+      <w:r>
+        <w:rPr>
+          <w:sz w:val="21"/>
+          <w:szCs w:val="21"/>
+        </w:rPr>
+        <w:t xml:space="preserve">, </w:t>
+      </w:r>
+      <w:proofErr w:type="spellStart"/>
+      <w:r>
+        <w:rPr>
+          <w:sz w:val="21"/>
+          <w:szCs w:val="21"/>
+        </w:rPr>
+        <w:t>Stakataka</w:t>
+      </w:r>
+      <w:proofErr w:type="spellEnd"/>
+      <w:r>
+        <w:rPr>
+          <w:sz w:val="21"/>
+          <w:szCs w:val="21"/>
+        </w:rPr>
+        <w:t xml:space="preserve">, </w:t>
+      </w:r>
+      <w:proofErr w:type="spellStart"/>
+      <w:r>
+        <w:rPr>
+          <w:sz w:val="21"/>
+          <w:szCs w:val="21"/>
+        </w:rPr>
+        <w:t>Wobbuffet</w:t>
+      </w:r>
+      <w:proofErr w:type="spellEnd"/>
+      <w:r>
+        <w:rPr>
+          <w:sz w:val="21"/>
+          <w:szCs w:val="21"/>
+        </w:rPr>
+        <w:t xml:space="preserve">, </w:t>
+      </w:r>
+      <w:proofErr w:type="spellStart"/>
+      <w:r>
+        <w:rPr>
+          <w:sz w:val="21"/>
+          <w:szCs w:val="21"/>
+        </w:rPr>
+        <w:t>Regice</w:t>
+      </w:r>
+      <w:proofErr w:type="spellEnd"/>
+      <w:r>
+        <w:rPr>
+          <w:sz w:val="21"/>
+          <w:szCs w:val="21"/>
+        </w:rPr>
+        <w:t xml:space="preserve">, </w:t>
+      </w:r>
+      <w:proofErr w:type="spellStart"/>
+      <w:r>
+        <w:rPr>
+          <w:sz w:val="21"/>
+          <w:szCs w:val="21"/>
+        </w:rPr>
+        <w:t>Regidrago</w:t>
+      </w:r>
+      <w:proofErr w:type="spellEnd"/>
+      <w:r>
+        <w:rPr>
+          <w:sz w:val="21"/>
+          <w:szCs w:val="21"/>
+        </w:rPr>
+        <w:t xml:space="preserve">, </w:t>
+      </w:r>
+      <w:proofErr w:type="spellStart"/>
+      <w:r>
+        <w:rPr>
+          <w:sz w:val="21"/>
+          <w:szCs w:val="21"/>
+        </w:rPr>
+        <w:t>Steelix</w:t>
+      </w:r>
+      <w:proofErr w:type="spellEnd"/>
+      <w:r>
+        <w:rPr>
+          <w:sz w:val="21"/>
+          <w:szCs w:val="21"/>
+        </w:rPr>
+        <w:t xml:space="preserve">, and </w:t>
+      </w:r>
+      <w:proofErr w:type="spellStart"/>
+      <w:r>
+        <w:rPr>
+          <w:sz w:val="21"/>
+          <w:szCs w:val="21"/>
+        </w:rPr>
+        <w:t>Regieleki</w:t>
+      </w:r>
+      <w:proofErr w:type="spellEnd"/>
+      <w:r>
+        <w:rPr>
+          <w:sz w:val="21"/>
+          <w:szCs w:val="21"/>
+        </w:rPr>
+        <w:t xml:space="preserve"> complete the top ten, each combining an extreme value in one or two stats with comparatively low values elsewhere. Estimated models should be inspected for the presence of overly influential observations and of non-linear relationships with the numerical variables.</w:t>
+      </w:r>
+    </w:p>
+    <w:p>
+      <w:pPr>
+        <w:spacing w:after="120"/>
+      </w:pPr>
+      <w:r>
+        <w:rPr>
+          <w:sz w:val="21"/>
+          <w:szCs w:val="21"/>
+        </w:rPr>
+        <w:t xml:space="preserve">The evaluation of metrics that allow influential species to be identified during </w:t>
+      </w:r>
+      <w:proofErr w:type="spellStart"/>
+      <w:r>
+        <w:rPr>
+          <w:sz w:val="21"/>
+          <w:szCs w:val="21"/>
+        </w:rPr>
         <w:t>modeling</w:t>
       </w:r>
       <w:proofErr w:type="spellEnd"/>
@@ -4053,19 +4558,7 @@
           <w:sz w:val="21"/>
           <w:szCs w:val="21"/>
         </w:rPr>
-        <w:t xml:space="preserve"> might not contribute much to prediction.</w:t>
-      </w:r>
-    </w:p>
-    <w:p>
-      <w:pPr>
-        <w:spacing w:after="120"/>
-      </w:pPr>
-      <w:r>
-        <w:rPr>
-          <w:sz w:val="21"/>
-          <w:szCs w:val="21"/>
-        </w:rPr>
-        <w:t xml:space="preserve">The base stats variables are generally strongly associated to total, but not necessarily over the whole range of their values (total does not increase with HP, special </w:t>
+        <w:t xml:space="preserve">, the comparison of these species with those flagged by the profile imbalance index computed during IDA, and the sensitivity analyses that explore the changes in </w:t>
       </w:r>
       <w:proofErr w:type="spellStart"/>
       <w:r>
@@ -4073,7 +4566,7 @@
           <w:sz w:val="21"/>
           <w:szCs w:val="21"/>
         </w:rPr>
-        <w:t>defense</w:t>
+        <w:t>modeling</w:t>
       </w:r>
       <w:proofErr w:type="spellEnd"/>
       <w:r>
@@ -4081,425 +4574,7 @@
           <w:sz w:val="21"/>
           <w:szCs w:val="21"/>
         </w:rPr>
-        <w:t xml:space="preserve"> and </w:t>
-      </w:r>
-      <w:proofErr w:type="spellStart"/>
-      <w:r>
-        <w:rPr>
-          <w:sz w:val="21"/>
-          <w:szCs w:val="21"/>
-        </w:rPr>
-        <w:t>defense</w:t>
-      </w:r>
-      <w:proofErr w:type="spellEnd"/>
-      <w:r>
-        <w:rPr>
-          <w:sz w:val="21"/>
-          <w:szCs w:val="21"/>
-        </w:rPr>
-        <w:t xml:space="preserve"> for their large values, some Pokémon can have large/low values of one variable but not necessarily also in the total). The base stats are less associated with height compared to total. The six base stats seem to carry additional information compared to Total, speed has distinct features from others, for example speed and </w:t>
-      </w:r>
-      <w:proofErr w:type="spellStart"/>
-      <w:r>
-        <w:rPr>
-          <w:sz w:val="21"/>
-          <w:szCs w:val="21"/>
-        </w:rPr>
-        <w:t>defense</w:t>
-      </w:r>
-      <w:proofErr w:type="spellEnd"/>
-      <w:r>
-        <w:rPr>
-          <w:sz w:val="21"/>
-          <w:szCs w:val="21"/>
-        </w:rPr>
-        <w:t xml:space="preserve"> have an extremely low correlation. In regression model the use of the six base stats might be more informative than the use of total, as the six base stats provide to some extent some heterogeneous information about the Pokémon strengths.</w:t>
-      </w:r>
-    </w:p>
-    <w:p>
-      <w:pPr>
-        <w:spacing w:after="120"/>
-      </w:pPr>
-      <w:r>
-        <w:rPr>
-          <w:sz w:val="21"/>
-          <w:szCs w:val="21"/>
-        </w:rPr>
-        <w:t xml:space="preserve">It is however possible that the correlation between the base stats might inflate the standard errors of the estimated coefficient, or cause some instability in the model, or that some of the variables will not contribute to improve prediction (for example special attack and special </w:t>
-      </w:r>
-      <w:proofErr w:type="spellStart"/>
-      <w:r>
-        <w:rPr>
-          <w:sz w:val="21"/>
-          <w:szCs w:val="21"/>
-        </w:rPr>
-        <w:t>defense</w:t>
-      </w:r>
-      <w:proofErr w:type="spellEnd"/>
-      <w:r>
-        <w:rPr>
-          <w:sz w:val="21"/>
-          <w:szCs w:val="21"/>
-        </w:rPr>
-        <w:t>, see also the graphs in the next section).</w:t>
-      </w:r>
-    </w:p>
-    <w:p>
-      <w:pPr>
-        <w:spacing w:after="120"/>
-      </w:pPr>
-      <w:r>
-        <w:rPr>
-          <w:sz w:val="21"/>
-          <w:szCs w:val="21"/>
-        </w:rPr>
-        <w:t>We observed a large association also between other variables that we are considering as potential explanatory variables in the multivariable model. For example, evolutionary stage and special status are strongly associated. Nevertheless, both variables are considered potentially important based on background knowledge. Therefore, we decided to employ backward variable selection based on AIC to select the variables to include in a final model. Log-transformed variables were created (</w:t>
-      </w:r>
-      <w:proofErr w:type="spellStart"/>
-      <w:r>
-        <w:rPr>
-          <w:sz w:val="21"/>
-          <w:szCs w:val="21"/>
-        </w:rPr>
-        <w:t>log_weight_kg</w:t>
-      </w:r>
-      <w:proofErr w:type="spellEnd"/>
-      <w:r>
-        <w:rPr>
-          <w:sz w:val="21"/>
-          <w:szCs w:val="21"/>
-        </w:rPr>
-        <w:t xml:space="preserve"> and </w:t>
-      </w:r>
-      <w:proofErr w:type="spellStart"/>
-      <w:r>
-        <w:rPr>
-          <w:sz w:val="21"/>
-          <w:szCs w:val="21"/>
-        </w:rPr>
-        <w:t>log_height_m</w:t>
-      </w:r>
-      <w:proofErr w:type="spellEnd"/>
-      <w:r>
-        <w:rPr>
-          <w:sz w:val="21"/>
-          <w:szCs w:val="21"/>
-        </w:rPr>
-        <w:t>), and histograms and Q-Q plots show the transformed versions are approximately normally distributed. These transformed versions of weight and height will be used as the outcome and explanatory variables in the regression models, respectively.</w:t>
-      </w:r>
-    </w:p>
-    <w:p>
-      <w:pPr>
-        <w:spacing w:after="120"/>
-      </w:pPr>
-      <w:r>
-        <w:rPr>
-          <w:sz w:val="21"/>
-          <w:szCs w:val="21"/>
-        </w:rPr>
-        <w:t>The Baby Pokémon phase category has a small sample size (only 17 observed). Therefore, Base will be used as the reference category for Pokémon phase. Similarly, normal status and normal happiness will be used as reference categories.</w:t>
-      </w:r>
-    </w:p>
-    <w:p>
-      <w:pPr>
-        <w:spacing w:after="120"/>
-      </w:pPr>
-      <w:r>
-        <w:rPr>
-          <w:sz w:val="21"/>
-          <w:szCs w:val="21"/>
-        </w:rPr>
-        <w:t xml:space="preserve">To identify Pokémon species with unusual combinations of base-stat values in a systematic and reproducible way, we defined a profile imbalance index: each of the six base stats was standardized (z-scores across all 1,025 species), and for each species we computed the standard deviation of its own six standardized values. </w:t>
-      </w:r>
-      <w:proofErr w:type="spellStart"/>
-      <w:r>
-        <w:rPr>
-          <w:sz w:val="21"/>
-          <w:szCs w:val="21"/>
-        </w:rPr>
-        <w:t>Shuckle</w:t>
-      </w:r>
-      <w:proofErr w:type="spellEnd"/>
-      <w:r>
-        <w:rPr>
-          <w:sz w:val="21"/>
-          <w:szCs w:val="21"/>
-        </w:rPr>
-        <w:t xml:space="preserve"> has the single most unbalanced profile: very low hp, attack and special attack, but the highest </w:t>
-      </w:r>
-      <w:proofErr w:type="spellStart"/>
-      <w:r>
-        <w:rPr>
-          <w:sz w:val="21"/>
-          <w:szCs w:val="21"/>
-        </w:rPr>
-        <w:t>defense</w:t>
-      </w:r>
-      <w:proofErr w:type="spellEnd"/>
-      <w:r>
-        <w:rPr>
-          <w:sz w:val="21"/>
-          <w:szCs w:val="21"/>
-        </w:rPr>
-        <w:t xml:space="preserve"> and special </w:t>
-      </w:r>
-      <w:proofErr w:type="spellStart"/>
-      <w:r>
-        <w:rPr>
-          <w:sz w:val="21"/>
-          <w:szCs w:val="21"/>
-        </w:rPr>
-        <w:t>defense</w:t>
-      </w:r>
-      <w:proofErr w:type="spellEnd"/>
-      <w:r>
-        <w:rPr>
-          <w:sz w:val="21"/>
-          <w:szCs w:val="21"/>
-        </w:rPr>
-        <w:t xml:space="preserve"> in the dataset. </w:t>
-      </w:r>
-      <w:proofErr w:type="spellStart"/>
-      <w:r>
-        <w:rPr>
-          <w:sz w:val="21"/>
-          <w:szCs w:val="21"/>
-        </w:rPr>
-        <w:t>Blissey</w:t>
-      </w:r>
-      <w:proofErr w:type="spellEnd"/>
-      <w:r>
-        <w:rPr>
-          <w:sz w:val="21"/>
-          <w:szCs w:val="21"/>
-        </w:rPr>
-        <w:t xml:space="preserve"> and Chansey rank second and third, with extremely high hp but low attack and </w:t>
-      </w:r>
-      <w:proofErr w:type="spellStart"/>
-      <w:r>
-        <w:rPr>
-          <w:sz w:val="21"/>
-          <w:szCs w:val="21"/>
-        </w:rPr>
-        <w:t>defense</w:t>
-      </w:r>
-      <w:proofErr w:type="spellEnd"/>
-      <w:r>
-        <w:rPr>
-          <w:sz w:val="21"/>
-          <w:szCs w:val="21"/>
-        </w:rPr>
-        <w:t xml:space="preserve">. </w:t>
-      </w:r>
-      <w:proofErr w:type="spellStart"/>
-      <w:r>
-        <w:rPr>
-          <w:sz w:val="21"/>
-          <w:szCs w:val="21"/>
-        </w:rPr>
-        <w:t>Guzzlord</w:t>
-      </w:r>
-      <w:proofErr w:type="spellEnd"/>
-      <w:r>
-        <w:rPr>
-          <w:sz w:val="21"/>
-          <w:szCs w:val="21"/>
-        </w:rPr>
-        <w:t xml:space="preserve">, </w:t>
-      </w:r>
-      <w:proofErr w:type="spellStart"/>
-      <w:r>
-        <w:rPr>
-          <w:sz w:val="21"/>
-          <w:szCs w:val="21"/>
-        </w:rPr>
-        <w:t>Stakataka</w:t>
-      </w:r>
-      <w:proofErr w:type="spellEnd"/>
-      <w:r>
-        <w:rPr>
-          <w:sz w:val="21"/>
-          <w:szCs w:val="21"/>
-        </w:rPr>
-        <w:t xml:space="preserve">, </w:t>
-      </w:r>
-      <w:proofErr w:type="spellStart"/>
-      <w:r>
-        <w:rPr>
-          <w:sz w:val="21"/>
-          <w:szCs w:val="21"/>
-        </w:rPr>
-        <w:t>Wobbuffet</w:t>
-      </w:r>
-      <w:proofErr w:type="spellEnd"/>
-      <w:r>
-        <w:rPr>
-          <w:sz w:val="21"/>
-          <w:szCs w:val="21"/>
-        </w:rPr>
-        <w:t xml:space="preserve">, </w:t>
-      </w:r>
-      <w:proofErr w:type="spellStart"/>
-      <w:r>
-        <w:rPr>
-          <w:sz w:val="21"/>
-          <w:szCs w:val="21"/>
-        </w:rPr>
-        <w:t>Regice</w:t>
-      </w:r>
-      <w:proofErr w:type="spellEnd"/>
-      <w:r>
-        <w:rPr>
-          <w:sz w:val="21"/>
-          <w:szCs w:val="21"/>
-        </w:rPr>
-        <w:t xml:space="preserve">, </w:t>
-      </w:r>
-      <w:proofErr w:type="spellStart"/>
-      <w:r>
-        <w:rPr>
-          <w:sz w:val="21"/>
-          <w:szCs w:val="21"/>
-        </w:rPr>
-        <w:lastRenderedPageBreak/>
-        <w:t>Regidrago</w:t>
-      </w:r>
-      <w:proofErr w:type="spellEnd"/>
-      <w:r>
-        <w:rPr>
-          <w:sz w:val="21"/>
-          <w:szCs w:val="21"/>
-        </w:rPr>
-        <w:t xml:space="preserve">, </w:t>
-      </w:r>
-      <w:proofErr w:type="spellStart"/>
-      <w:r>
-        <w:rPr>
-          <w:sz w:val="21"/>
-          <w:szCs w:val="21"/>
-        </w:rPr>
-        <w:t>Steelix</w:t>
-      </w:r>
-      <w:proofErr w:type="spellEnd"/>
-      <w:r>
-        <w:rPr>
-          <w:sz w:val="21"/>
-          <w:szCs w:val="21"/>
-        </w:rPr>
-        <w:t xml:space="preserve">, and </w:t>
-      </w:r>
-      <w:proofErr w:type="spellStart"/>
-      <w:r>
-        <w:rPr>
-          <w:sz w:val="21"/>
-          <w:szCs w:val="21"/>
-        </w:rPr>
-        <w:t>Regieleki</w:t>
-      </w:r>
-      <w:proofErr w:type="spellEnd"/>
-      <w:r>
-        <w:rPr>
-          <w:sz w:val="21"/>
-          <w:szCs w:val="21"/>
-        </w:rPr>
-        <w:t xml:space="preserve"> complete the top ten, each combining an extreme value in one or two stats with comparatively low values elsewhere. Estimated models should be inspected for the presence of overly influential observations and of non-linear relationships with the numerical variables.</w:t>
-      </w:r>
-    </w:p>
-    <w:p>
-      <w:pPr>
-        <w:spacing w:after="120"/>
-      </w:pPr>
-      <w:r>
-        <w:rPr>
-          <w:sz w:val="21"/>
-          <w:szCs w:val="21"/>
-        </w:rPr>
-        <w:t xml:space="preserve">The evaluation of metrics that allow influential species to be identified during </w:t>
-      </w:r>
-      <w:proofErr w:type="spellStart"/>
-      <w:r>
-        <w:rPr>
-          <w:sz w:val="21"/>
-          <w:szCs w:val="21"/>
-        </w:rPr>
-        <w:t>modeling</w:t>
-      </w:r>
-      <w:proofErr w:type="spellEnd"/>
-      <w:r>
-        <w:rPr>
-          <w:sz w:val="21"/>
-          <w:szCs w:val="21"/>
-        </w:rPr>
-        <w:t xml:space="preserve">, the comparison of these species with those flagged by the profile imbalance index computed during IDA, and the sensitivity analyses that explore the changes in </w:t>
-      </w:r>
-      <w:proofErr w:type="spellStart"/>
-      <w:r>
-        <w:rPr>
-          <w:sz w:val="21"/>
-          <w:szCs w:val="21"/>
-        </w:rPr>
-        <w:t>modeling</w:t>
-      </w:r>
-      <w:proofErr w:type="spellEnd"/>
-      <w:r>
-        <w:rPr>
-          <w:sz w:val="21"/>
-          <w:szCs w:val="21"/>
-        </w:rPr>
         <w:t xml:space="preserve"> results after removing species that have large values of Cook’s distance, are included in the amended SAP.</w:t>
-      </w:r>
-    </w:p>
-    <w:p>
-      <w:pPr>
-        <w:spacing w:after="120"/>
-        <w:rPr>
-          <w:b/>
-          <w:bCs/>
-          <w:sz w:val="21"/>
-          <w:szCs w:val="21"/>
-        </w:rPr>
-      </w:pPr>
-      <w:r>
-        <w:rPr>
-          <w:b/>
-          <w:bCs/>
-          <w:sz w:val="21"/>
-          <w:szCs w:val="21"/>
-        </w:rPr>
-        <w:t xml:space="preserve">Findings from </w:t>
-      </w:r>
-      <w:r>
-        <w:rPr>
-          <w:b/>
-          <w:bCs/>
-          <w:sz w:val="21"/>
-          <w:szCs w:val="21"/>
-        </w:rPr>
-        <w:t>modelling</w:t>
-      </w:r>
-    </w:p>
-    <w:p>
-      <w:pPr>
-        <w:spacing w:after="120"/>
-      </w:pPr>
-      <w:r>
-        <w:t>The model using log2-transformed height and weight showed more homogeneous residual variance and residuals closer to normality than a model on the original scale. Residual diagnostics nevertheless revealed a localized lack of fit for the tallest Pokémon species, which led to the addition of an untransformed height term (</w:t>
-      </w:r>
-      <w:proofErr w:type="spellStart"/>
-      <w:r>
-        <w:t>height_m</w:t>
-      </w:r>
-      <w:proofErr w:type="spellEnd"/>
-      <w:r>
-        <w:t>) alongside log2(</w:t>
-      </w:r>
-      <w:proofErr w:type="spellStart"/>
-      <w:r>
-        <w:t>height_m</w:t>
-      </w:r>
-      <w:proofErr w:type="spellEnd"/>
-      <w:r>
-        <w:t>) in the regression model.</w:t>
       </w:r>
     </w:p>
     <w:p>
@@ -7532,6 +7607,92 @@
       </w:pPr>
     </w:lvl>
   </w:abstractNum>
+  <w:abstractNum w:abstractNumId="2" w15:restartNumberingAfterBreak="0">
+    <w:nsid w:val="33F408B2"/>
+    <w:multiLevelType w:val="hybridMultilevel"/>
+    <w:tmpl w:val="A1C69048"/>
+    <w:lvl w:ilvl="0" w:tplc="B588B180">
+      <w:start w:val="1"/>
+      <w:numFmt w:val="decimal"/>
+      <w:lvlText w:val="%1."/>
+      <w:lvlJc w:val="left"/>
+      <w:pPr>
+        <w:ind w:left="720" w:hanging="360"/>
+      </w:pPr>
+    </w:lvl>
+    <w:lvl w:ilvl="1" w:tplc="30D612FA">
+      <w:start w:val="1"/>
+      <w:numFmt w:val="lowerLetter"/>
+      <w:lvlText w:val="%2."/>
+      <w:lvlJc w:val="left"/>
+      <w:pPr>
+        <w:ind w:left="1440" w:hanging="360"/>
+      </w:pPr>
+    </w:lvl>
+    <w:lvl w:ilvl="2" w:tplc="7A466E0A">
+      <w:start w:val="1"/>
+      <w:numFmt w:val="lowerRoman"/>
+      <w:lvlText w:val="%3."/>
+      <w:lvlJc w:val="right"/>
+      <w:pPr>
+        <w:ind w:left="2160" w:hanging="180"/>
+      </w:pPr>
+    </w:lvl>
+    <w:lvl w:ilvl="3" w:tplc="FEACD118">
+      <w:start w:val="1"/>
+      <w:numFmt w:val="decimal"/>
+      <w:lvlText w:val="%4."/>
+      <w:lvlJc w:val="left"/>
+      <w:pPr>
+        <w:ind w:left="2880" w:hanging="360"/>
+      </w:pPr>
+    </w:lvl>
+    <w:lvl w:ilvl="4" w:tplc="37C6FF1A">
+      <w:start w:val="1"/>
+      <w:numFmt w:val="lowerLetter"/>
+      <w:lvlText w:val="%5."/>
+      <w:lvlJc w:val="left"/>
+      <w:pPr>
+        <w:ind w:left="3600" w:hanging="360"/>
+      </w:pPr>
+    </w:lvl>
+    <w:lvl w:ilvl="5" w:tplc="1AF6D956">
+      <w:start w:val="1"/>
+      <w:numFmt w:val="lowerRoman"/>
+      <w:lvlText w:val="%6."/>
+      <w:lvlJc w:val="right"/>
+      <w:pPr>
+        <w:ind w:left="4320" w:hanging="180"/>
+      </w:pPr>
+    </w:lvl>
+    <w:lvl w:ilvl="6" w:tplc="6F0E0E2E">
+      <w:start w:val="1"/>
+      <w:numFmt w:val="decimal"/>
+      <w:lvlText w:val="%7."/>
+      <w:lvlJc w:val="left"/>
+      <w:pPr>
+        <w:ind w:left="5040" w:hanging="360"/>
+      </w:pPr>
+    </w:lvl>
+    <w:lvl w:ilvl="7" w:tplc="46BAB856">
+      <w:start w:val="1"/>
+      <w:numFmt w:val="lowerLetter"/>
+      <w:lvlText w:val="%8."/>
+      <w:lvlJc w:val="left"/>
+      <w:pPr>
+        <w:ind w:left="5760" w:hanging="360"/>
+      </w:pPr>
+    </w:lvl>
+    <w:lvl w:ilvl="8" w:tplc="6EDE9F22">
+      <w:start w:val="1"/>
+      <w:numFmt w:val="lowerRoman"/>
+      <w:lvlText w:val="%9."/>
+      <w:lvlJc w:val="right"/>
+      <w:pPr>
+        <w:ind w:left="6480" w:hanging="180"/>
+      </w:pPr>
+    </w:lvl>
+  </w:abstractNum>
   <w:num w:numId="1" w16cid:durableId="1291473243">
     <w:abstractNumId w:val="1"/>
     <w:lvlOverride w:ilvl="0">
@@ -7543,6 +7704,9 @@
     <w:lvlOverride w:ilvl="0">
       <w:startOverride w:val="1"/>
     </w:lvlOverride>
+  </w:num>
+  <w:num w:numId="3" w16cid:durableId="733239263">
+    <w:abstractNumId w:val="2"/>
   </w:num>
 </w:numbering>
 </file>
@@ -8025,6 +8189,7 @@
   <w:style w:type="character" w:default="1" w:styleId="DefaultParagraphFont">
     <w:name w:val="Default Paragraph Font"/>
     <w:uiPriority w:val="1"/>
+    <w:semiHidden/>
     <w:unhideWhenUsed/>
   </w:style>
   <w:style w:type="table" w:default="1" w:styleId="TableNormal">
@@ -8131,6 +8296,28 @@
       <w:sz w:val="20"/>
       <w:szCs w:val="20"/>
     </w:rPr>
+  </w:style>
+  <w:style w:type="paragraph" w:customStyle="1" w:styleId="Affiliation">
+    <w:name w:val="Affiliation"/>
+    <w:basedOn w:val="Normal"/>
+    <w:qFormat/>
+    <w:rsid w:val="00447BEA"/>
+    <w:pPr>
+      <w:spacing w:before="240" w:line="360" w:lineRule="auto"/>
+    </w:pPr>
+    <w:rPr>
+      <w:i/>
+      <w:sz w:val="24"/>
+      <w:szCs w:val="24"/>
+      <w:lang w:val="en-GB" w:eastAsia="en-GB"/>
+    </w:rPr>
+  </w:style>
+  <w:style w:type="paragraph" w:styleId="Revision">
+    <w:name w:val="Revision"/>
+    <w:hidden/>
+    <w:uiPriority w:val="99"/>
+    <w:semiHidden/>
+    <w:rsid w:val="00447BEA"/>
   </w:style>
 </w:styles>
 </file>
@@ -8448,4 +8635,16 @@
     </a:ext>
   </a:extLst>
 </a:theme>
+</file>
+
+<file path=customXml/item1.xml><?xml version="1.0" encoding="utf-8"?>
+<b:Sources xmlns:b="http://schemas.openxmlformats.org/officeDocument/2006/bibliography" xmlns="http://schemas.openxmlformats.org/officeDocument/2006/bibliography" SelectedStyle="\APASixthEditionOfficeOnline.xsl" StyleName="APA" Version="6"/>
+</file>
+
+<file path=customXml/itemProps1.xml><?xml version="1.0" encoding="utf-8"?>
+<ds:datastoreItem xmlns:ds="http://schemas.openxmlformats.org/officeDocument/2006/customXml" ds:itemID="{50BA4E4F-847E-4F8A-83B9-7C36B5BC66A6}">
+  <ds:schemaRefs>
+    <ds:schemaRef ds:uri="http://schemas.openxmlformats.org/officeDocument/2006/bibliography"/>
+  </ds:schemaRefs>
+</ds:datastoreItem>
 </file>
</xml_diff>